<commit_message>
fix: corregir generadores de Reporte y PDFs
- Reporte: corregir .str.extract para columnas mixtas (int/str) en GRADO
- Reporte: exportar PDFs a carpeta Reportes/
- Reporte: formato CALIFICACION como texto "0.0" en vez de "(3,9)"
- PDFs: remover argumentos inválidos de OpenDataSource (ConfirmConversions, ReadOnly, etc.)
- PDFs: agregar limpieza COM (del + gc.collect) entre iteraciones
- PDFs: formato CALIFICACIÓN como texto "0.0"
- PDFs: archivos temporales Excel en temp_excels en vez de pdfs_por_grado
- Agregar config.ini.example, .gitignore por carpeta, Utils y README
</commit_message>
<xml_diff>
--- a/PDFs/config/plantilla.docx
+++ b/PDFs/config/plantilla.docx
@@ -361,7 +361,7 @@
           <w:noProof/>
         </w:rPr>
         <w:drawing>
-          <wp:anchor distT="0" distB="0" distL="114300" distR="114300" simplePos="0" relativeHeight="251609600" behindDoc="0" locked="0" layoutInCell="1" allowOverlap="1" wp14:anchorId="76D89750" wp14:editId="33079778">
+          <wp:anchor distT="0" distB="0" distL="114300" distR="114300" simplePos="0" relativeHeight="251609600" behindDoc="0" locked="0" layoutInCell="1" allowOverlap="1" wp14:anchorId="76D89750" wp14:editId="5BD73844">
             <wp:simplePos x="0" y="0"/>
             <wp:positionH relativeFrom="column">
               <wp:posOffset>4631055</wp:posOffset>
@@ -2248,14 +2248,7 @@
                                 <w:szCs w:val="16"/>
                                 <w:lang w:val="es-CO"/>
                               </w:rPr>
-                              <w:t>2</w:t>
-                            </w:r>
-                            <w:r>
-                              <w:rPr>
-                                <w:szCs w:val="16"/>
-                                <w:lang w:val="es-CO"/>
-                              </w:rPr>
-                              <w:t>1</w:t>
+                              <w:t>23</w:t>
                             </w:r>
                             <w:r>
                               <w:rPr>
@@ -2269,7 +2262,7 @@
                                 <w:szCs w:val="16"/>
                                 <w:lang w:val="es-CO"/>
                               </w:rPr>
-                              <w:t>4</w:t>
+                              <w:t>3</w:t>
                             </w:r>
                             <w:r>
                               <w:rPr>
@@ -2340,14 +2333,7 @@
                           <w:szCs w:val="16"/>
                           <w:lang w:val="es-CO"/>
                         </w:rPr>
-                        <w:t>2</w:t>
-                      </w:r>
-                      <w:r>
-                        <w:rPr>
-                          <w:szCs w:val="16"/>
-                          <w:lang w:val="es-CO"/>
-                        </w:rPr>
-                        <w:t>1</w:t>
+                        <w:t>23</w:t>
                       </w:r>
                       <w:r>
                         <w:rPr>
@@ -2361,7 +2347,7 @@
                           <w:szCs w:val="16"/>
                           <w:lang w:val="es-CO"/>
                         </w:rPr>
-                        <w:t>4</w:t>
+                        <w:t>3</w:t>
                       </w:r>
                       <w:r>
                         <w:rPr>

</xml_diff>